<commit_message>
Edited font and removed unnecessary tags in template files; removed unnecessary tags from attachment block in yml file; edited docket_numbers tag in attachment block for FOC 67 to accomodate repeats; changed file name of main motion doc to reflect FOC 115; edited third party kickout question
</commit_message>
<xml_diff>
--- a/docassemble/MLHMotionRegardingChangeOfDomicile/data/templates/motion_re_cod_attachment.docx
+++ b/docassemble/MLHMotionRegardingChangeOfDomicile/data/templates/motion_re_cod_attachment.docx
@@ -31,7 +31,6 @@
             <w:pPr>
               <w:jc w:val="right"/>
               <w:rPr>
-                <w:rFonts w:ascii="Times New Roman" w:hAnsi="Times New Roman" w:cs="Times New Roman"/>
                 <w:b/>
                 <w:bCs/>
                 <w:sz w:val="20"/>
@@ -40,7 +39,6 @@
             </w:pPr>
             <w:r>
               <w:rPr>
-                <w:rFonts w:ascii="Times New Roman" w:hAnsi="Times New Roman" w:cs="Times New Roman"/>
                 <w:b/>
                 <w:bCs/>
                 <w:sz w:val="24"/>
@@ -50,7 +48,6 @@
             </w:r>
             <w:r>
               <w:rPr>
-                <w:rFonts w:ascii="Times New Roman" w:hAnsi="Times New Roman" w:cs="Times New Roman"/>
                 <w:b/>
                 <w:bCs/>
                 <w:sz w:val="24"/>
@@ -61,7 +58,6 @@
             </w:r>
             <w:r>
               <w:rPr>
-                <w:rFonts w:ascii="Times New Roman" w:hAnsi="Times New Roman" w:cs="Times New Roman"/>
                 <w:b/>
                 <w:bCs/>
                 <w:sz w:val="24"/>
@@ -71,7 +67,6 @@
             </w:r>
             <w:r>
               <w:rPr>
-                <w:rFonts w:ascii="Times New Roman" w:hAnsi="Times New Roman" w:cs="Times New Roman"/>
                 <w:sz w:val="24"/>
                 <w:szCs w:val="24"/>
               </w:rPr>
@@ -79,7 +74,29 @@
             </w:r>
             <w:r>
               <w:rPr>
-                <w:rFonts w:ascii="Times New Roman" w:hAnsi="Times New Roman" w:cs="Times New Roman"/>
+                <w:sz w:val="24"/>
+                <w:szCs w:val="24"/>
+              </w:rPr>
+              <w:t xml:space="preserve"> </w:t>
+            </w:r>
+            <w:proofErr w:type="spellStart"/>
+            <w:r>
+              <w:rPr>
+                <w:sz w:val="24"/>
+                <w:szCs w:val="24"/>
+              </w:rPr>
+              <w:t>county</w:t>
+            </w:r>
+            <w:r>
+              <w:rPr>
+                <w:sz w:val="24"/>
+                <w:szCs w:val="24"/>
+              </w:rPr>
+              <w:t>_choice</w:t>
+            </w:r>
+            <w:proofErr w:type="spellEnd"/>
+            <w:r>
+              <w:rPr>
                 <w:sz w:val="24"/>
                 <w:szCs w:val="24"/>
               </w:rPr>
@@ -87,23 +104,6 @@
             </w:r>
             <w:r>
               <w:rPr>
-                <w:rFonts w:ascii="Times New Roman" w:hAnsi="Times New Roman" w:cs="Times New Roman"/>
-                <w:sz w:val="24"/>
-                <w:szCs w:val="24"/>
-              </w:rPr>
-              <w:t>county</w:t>
-            </w:r>
-            <w:r>
-              <w:rPr>
-                <w:rFonts w:ascii="Times New Roman" w:hAnsi="Times New Roman" w:cs="Times New Roman"/>
-                <w:sz w:val="24"/>
-                <w:szCs w:val="24"/>
-              </w:rPr>
-              <w:t xml:space="preserve">_choice </w:t>
-            </w:r>
-            <w:r>
-              <w:rPr>
-                <w:rFonts w:ascii="Times New Roman" w:hAnsi="Times New Roman" w:cs="Times New Roman"/>
                 <w:sz w:val="24"/>
                 <w:szCs w:val="24"/>
               </w:rPr>
@@ -111,7 +111,6 @@
             </w:r>
             <w:r>
               <w:rPr>
-                <w:rFonts w:ascii="Times New Roman" w:hAnsi="Times New Roman" w:cs="Times New Roman"/>
                 <w:b/>
                 <w:bCs/>
                 <w:sz w:val="24"/>
@@ -133,7 +132,6 @@
             <w:pPr>
               <w:jc w:val="center"/>
               <w:rPr>
-                <w:rFonts w:ascii="Times New Roman" w:hAnsi="Times New Roman" w:cs="Times New Roman"/>
                 <w:b/>
                 <w:bCs/>
                 <w:sz w:val="24"/>
@@ -142,7 +140,6 @@
             </w:pPr>
             <w:r>
               <w:rPr>
-                <w:rFonts w:ascii="Times New Roman" w:hAnsi="Times New Roman" w:cs="Times New Roman"/>
                 <w:b/>
                 <w:bCs/>
                 <w:sz w:val="24"/>
@@ -152,7 +149,6 @@
             </w:r>
             <w:r>
               <w:rPr>
-                <w:rFonts w:ascii="Times New Roman" w:hAnsi="Times New Roman" w:cs="Times New Roman"/>
                 <w:b/>
                 <w:bCs/>
                 <w:sz w:val="24"/>
@@ -176,7 +172,6 @@
             <w:pPr>
               <w:jc w:val="center"/>
               <w:rPr>
-                <w:rFonts w:ascii="Times New Roman" w:hAnsi="Times New Roman" w:cs="Times New Roman"/>
                 <w:b/>
                 <w:bCs/>
                 <w:sz w:val="24"/>
@@ -185,7 +180,6 @@
             </w:pPr>
             <w:r>
               <w:rPr>
-                <w:rFonts w:ascii="Times New Roman" w:hAnsi="Times New Roman" w:cs="Times New Roman"/>
                 <w:b/>
                 <w:bCs/>
                 <w:sz w:val="24"/>
@@ -198,7 +192,6 @@
             <w:pPr>
               <w:jc w:val="center"/>
               <w:rPr>
-                <w:rFonts w:ascii="Times New Roman" w:hAnsi="Times New Roman" w:cs="Times New Roman"/>
                 <w:b/>
                 <w:bCs/>
                 <w:sz w:val="24"/>
@@ -216,15 +209,22 @@
             </w:pPr>
             <w:r>
               <w:rPr>
-                <w:rFonts w:ascii="Times New Roman" w:hAnsi="Times New Roman" w:cs="Times New Roman"/>
                 <w:sz w:val="24"/>
                 <w:szCs w:val="24"/>
               </w:rPr>
-              <w:t>{{ docket_number</w:t>
+              <w:t xml:space="preserve">{{ </w:t>
             </w:r>
+            <w:proofErr w:type="spellStart"/>
             <w:r>
               <w:rPr>
-                <w:rFonts w:ascii="Times New Roman" w:hAnsi="Times New Roman" w:cs="Times New Roman"/>
+                <w:sz w:val="24"/>
+                <w:szCs w:val="24"/>
+              </w:rPr>
+              <w:t>docket_number</w:t>
+            </w:r>
+            <w:proofErr w:type="spellEnd"/>
+            <w:r>
+              <w:rPr>
                 <w:sz w:val="24"/>
                 <w:szCs w:val="24"/>
               </w:rPr>
@@ -232,7 +232,6 @@
             </w:r>
             <w:r>
               <w:rPr>
-                <w:rFonts w:ascii="Times New Roman" w:hAnsi="Times New Roman" w:cs="Times New Roman"/>
                 <w:sz w:val="24"/>
                 <w:szCs w:val="24"/>
               </w:rPr>
@@ -242,45 +241,127 @@
         </w:tc>
       </w:tr>
     </w:tbl>
+    <w:p/>
     <w:p>
       <w:pPr>
         <w:rPr>
-          <w:rFonts w:ascii="Times New Roman" w:hAnsi="Times New Roman" w:cs="Times New Roman"/>
-        </w:rPr>
-      </w:pPr>
+          <w:sz w:val="24"/>
+          <w:szCs w:val="24"/>
+        </w:rPr>
+      </w:pPr>
+      <w:r>
+        <w:rPr>
+          <w:sz w:val="24"/>
+          <w:szCs w:val="24"/>
+        </w:rPr>
+        <w:t>Paragraph 3:</w:t>
+      </w:r>
     </w:p>
     <w:p>
       <w:pPr>
         <w:rPr>
-          <w:rFonts w:ascii="Times New Roman" w:hAnsi="Times New Roman" w:cs="Times New Roman"/>
-          <w:b/>
-          <w:bCs/>
-          <w:sz w:val="24"/>
-          <w:szCs w:val="24"/>
-        </w:rPr>
-      </w:pPr>
-      <w:r>
-        <w:rPr>
-          <w:rFonts w:ascii="Times New Roman" w:hAnsi="Times New Roman" w:cs="Times New Roman"/>
-          <w:b/>
-          <w:bCs/>
-          <w:sz w:val="24"/>
-          <w:szCs w:val="24"/>
-        </w:rPr>
-        <w:t>Paragraph 3:</w:t>
+          <w:sz w:val="24"/>
+          <w:szCs w:val="24"/>
+        </w:rPr>
+      </w:pPr>
+      <w:r>
+        <w:rPr>
+          <w:sz w:val="24"/>
+          <w:szCs w:val="24"/>
+        </w:rPr>
+        <w:t xml:space="preserve">My proposed new residence is </w:t>
+      </w:r>
+      <w:r>
+        <w:rPr>
+          <w:sz w:val="24"/>
+          <w:szCs w:val="24"/>
+        </w:rPr>
+        <w:t xml:space="preserve">{{ </w:t>
+      </w:r>
+      <w:proofErr w:type="spellStart"/>
+      <w:r>
+        <w:rPr>
+          <w:sz w:val="24"/>
+          <w:szCs w:val="24"/>
+        </w:rPr>
+        <w:t>distance_from_other_parent</w:t>
+      </w:r>
+      <w:proofErr w:type="spellEnd"/>
+      <w:r>
+        <w:rPr>
+          <w:sz w:val="24"/>
+          <w:szCs w:val="24"/>
+        </w:rPr>
+        <w:t xml:space="preserve"> </w:t>
+      </w:r>
+      <w:r>
+        <w:rPr>
+          <w:sz w:val="24"/>
+          <w:szCs w:val="24"/>
+        </w:rPr>
+        <w:t>}}</w:t>
+      </w:r>
+      <w:r>
+        <w:rPr>
+          <w:sz w:val="24"/>
+          <w:szCs w:val="24"/>
+        </w:rPr>
+        <w:t xml:space="preserve"> miles from </w:t>
+      </w:r>
+      <w:r>
+        <w:rPr>
+          <w:sz w:val="24"/>
+          <w:szCs w:val="24"/>
+        </w:rPr>
+        <w:t xml:space="preserve">{{ </w:t>
+      </w:r>
+      <w:proofErr w:type="spellStart"/>
+      <w:r>
+        <w:rPr>
+          <w:sz w:val="24"/>
+          <w:szCs w:val="24"/>
+        </w:rPr>
+        <w:t>other_</w:t>
+      </w:r>
+      <w:r>
+        <w:rPr>
+          <w:sz w:val="24"/>
+          <w:szCs w:val="24"/>
+        </w:rPr>
+        <w:t>parties</w:t>
+      </w:r>
+      <w:proofErr w:type="spellEnd"/>
+      <w:r>
+        <w:rPr>
+          <w:sz w:val="24"/>
+          <w:szCs w:val="24"/>
+        </w:rPr>
+        <w:t>[0]</w:t>
+      </w:r>
+      <w:r>
+        <w:rPr>
+          <w:sz w:val="24"/>
+          <w:szCs w:val="24"/>
+        </w:rPr>
+        <w:t xml:space="preserve"> }}</w:t>
+      </w:r>
+      <w:r>
+        <w:rPr>
+          <w:sz w:val="24"/>
+          <w:szCs w:val="24"/>
+        </w:rPr>
+        <w:t>'s current residence.</w:t>
       </w:r>
     </w:p>
     <w:p>
       <w:pPr>
         <w:rPr>
-          <w:rFonts w:ascii="Times New Roman" w:hAnsi="Times New Roman" w:cs="Times New Roman"/>
-          <w:sz w:val="24"/>
-          <w:szCs w:val="24"/>
-        </w:rPr>
-      </w:pPr>
-      <w:r>
-        <w:rPr>
-          <w:rFonts w:ascii="Times New Roman" w:hAnsi="Times New Roman" w:cs="Times New Roman"/>
+          <w:sz w:val="24"/>
+          <w:szCs w:val="24"/>
+        </w:rPr>
+      </w:pPr>
+      <w:r>
+        <w:rPr>
           <w:sz w:val="24"/>
           <w:szCs w:val="24"/>
         </w:rPr>
@@ -288,23 +369,29 @@
       </w:r>
       <w:r>
         <w:rPr>
-          <w:rFonts w:ascii="Times New Roman" w:hAnsi="Times New Roman" w:cs="Times New Roman"/>
           <w:sz w:val="24"/>
           <w:szCs w:val="24"/>
         </w:rPr>
         <w:t xml:space="preserve">{{ </w:t>
       </w:r>
-      <w:r>
-        <w:rPr>
-          <w:rFonts w:ascii="Times New Roman" w:hAnsi="Times New Roman" w:cs="Times New Roman"/>
-          <w:sz w:val="24"/>
-          <w:szCs w:val="24"/>
-        </w:rPr>
-        <w:t xml:space="preserve">distance_from_other_parent </w:t>
-      </w:r>
-      <w:r>
-        <w:rPr>
-          <w:rFonts w:ascii="Times New Roman" w:hAnsi="Times New Roman" w:cs="Times New Roman"/>
+      <w:proofErr w:type="spellStart"/>
+      <w:r>
+        <w:rPr>
+          <w:sz w:val="24"/>
+          <w:szCs w:val="24"/>
+        </w:rPr>
+        <w:t>distance_from_current_residence</w:t>
+      </w:r>
+      <w:proofErr w:type="spellEnd"/>
+      <w:r>
+        <w:rPr>
+          <w:sz w:val="24"/>
+          <w:szCs w:val="24"/>
+        </w:rPr>
+        <w:t xml:space="preserve"> </w:t>
+      </w:r>
+      <w:r>
+        <w:rPr>
           <w:sz w:val="24"/>
           <w:szCs w:val="24"/>
         </w:rPr>
@@ -312,625 +399,621 @@
       </w:r>
       <w:r>
         <w:rPr>
-          <w:rFonts w:ascii="Times New Roman" w:hAnsi="Times New Roman" w:cs="Times New Roman"/>
-          <w:sz w:val="24"/>
-          <w:szCs w:val="24"/>
-        </w:rPr>
-        <w:t xml:space="preserve"> miles from </w:t>
-      </w:r>
-      <w:r>
-        <w:rPr>
-          <w:rFonts w:ascii="Times New Roman" w:hAnsi="Times New Roman" w:cs="Times New Roman"/>
-          <w:sz w:val="24"/>
-          <w:szCs w:val="24"/>
-        </w:rPr>
-        <w:t>{{ other_</w:t>
-      </w:r>
-      <w:r>
-        <w:rPr>
-          <w:rFonts w:ascii="Times New Roman" w:hAnsi="Times New Roman" w:cs="Times New Roman"/>
-          <w:sz w:val="24"/>
-          <w:szCs w:val="24"/>
-        </w:rPr>
-        <w:t>parties[0]</w:t>
-      </w:r>
-      <w:r>
-        <w:rPr>
-          <w:rFonts w:ascii="Times New Roman" w:hAnsi="Times New Roman" w:cs="Times New Roman"/>
-          <w:sz w:val="24"/>
-          <w:szCs w:val="24"/>
-        </w:rPr>
-        <w:t xml:space="preserve"> }}</w:t>
-      </w:r>
-      <w:r>
-        <w:rPr>
-          <w:rFonts w:ascii="Times New Roman" w:hAnsi="Times New Roman" w:cs="Times New Roman"/>
-          <w:sz w:val="24"/>
-          <w:szCs w:val="24"/>
-        </w:rPr>
-        <w:t>'s current residence.</w:t>
+          <w:sz w:val="24"/>
+          <w:szCs w:val="24"/>
+        </w:rPr>
+        <w:t xml:space="preserve"> miles from my current residence.</w:t>
       </w:r>
     </w:p>
     <w:p>
       <w:pPr>
         <w:rPr>
-          <w:rFonts w:ascii="Times New Roman" w:hAnsi="Times New Roman" w:cs="Times New Roman"/>
-          <w:sz w:val="24"/>
-          <w:szCs w:val="24"/>
-        </w:rPr>
-      </w:pPr>
-      <w:r>
-        <w:rPr>
-          <w:rFonts w:ascii="Times New Roman" w:hAnsi="Times New Roman" w:cs="Times New Roman"/>
-          <w:sz w:val="24"/>
-          <w:szCs w:val="24"/>
-        </w:rPr>
-        <w:t xml:space="preserve">My proposed new residence is </w:t>
-      </w:r>
-      <w:r>
-        <w:rPr>
-          <w:rFonts w:ascii="Times New Roman" w:hAnsi="Times New Roman" w:cs="Times New Roman"/>
-          <w:sz w:val="24"/>
-          <w:szCs w:val="24"/>
-        </w:rPr>
-        <w:t xml:space="preserve">{{ </w:t>
-      </w:r>
-      <w:r>
-        <w:rPr>
-          <w:rFonts w:ascii="Times New Roman" w:hAnsi="Times New Roman" w:cs="Times New Roman"/>
-          <w:sz w:val="24"/>
-          <w:szCs w:val="24"/>
-        </w:rPr>
-        <w:t xml:space="preserve">distance_from_current_residence </w:t>
-      </w:r>
-      <w:r>
-        <w:rPr>
-          <w:rFonts w:ascii="Times New Roman" w:hAnsi="Times New Roman" w:cs="Times New Roman"/>
-          <w:sz w:val="24"/>
-          <w:szCs w:val="24"/>
-        </w:rPr>
-        <w:t>}}</w:t>
-      </w:r>
-      <w:r>
-        <w:rPr>
-          <w:rFonts w:ascii="Times New Roman" w:hAnsi="Times New Roman" w:cs="Times New Roman"/>
-          <w:sz w:val="24"/>
-          <w:szCs w:val="24"/>
-        </w:rPr>
-        <w:t xml:space="preserve"> miles from my current residence.</w:t>
+          <w:sz w:val="24"/>
+          <w:szCs w:val="24"/>
+        </w:rPr>
+      </w:pPr>
+      <w:r>
+        <w:rPr>
+          <w:sz w:val="24"/>
+          <w:szCs w:val="24"/>
+        </w:rPr>
+        <w:t>I want the court to allow me and my child {{ child</w:t>
+      </w:r>
+      <w:r>
+        <w:rPr>
+          <w:sz w:val="24"/>
+          <w:szCs w:val="24"/>
+        </w:rPr>
+        <w:t>ren</w:t>
+      </w:r>
+      <w:r>
+        <w:rPr>
+          <w:sz w:val="24"/>
+          <w:szCs w:val="24"/>
+        </w:rPr>
+        <w:t>[0] }}, DOB: {{ child</w:t>
+      </w:r>
+      <w:r>
+        <w:rPr>
+          <w:sz w:val="24"/>
+          <w:szCs w:val="24"/>
+        </w:rPr>
+        <w:t>ren</w:t>
+      </w:r>
+      <w:r>
+        <w:rPr>
+          <w:sz w:val="24"/>
+          <w:szCs w:val="24"/>
+        </w:rPr>
+        <w:t>[0].</w:t>
+      </w:r>
+      <w:r>
+        <w:rPr>
+          <w:sz w:val="24"/>
+          <w:szCs w:val="24"/>
+        </w:rPr>
+        <w:t xml:space="preserve">birthdate </w:t>
+      </w:r>
+      <w:r>
+        <w:rPr>
+          <w:sz w:val="24"/>
+          <w:szCs w:val="24"/>
+        </w:rPr>
+        <w:t xml:space="preserve">}} to move because: {{ </w:t>
+      </w:r>
+      <w:proofErr w:type="spellStart"/>
+      <w:r>
+        <w:rPr>
+          <w:sz w:val="24"/>
+          <w:szCs w:val="24"/>
+        </w:rPr>
+        <w:t>moving_reason</w:t>
+      </w:r>
+      <w:proofErr w:type="spellEnd"/>
+      <w:r>
+        <w:rPr>
+          <w:sz w:val="24"/>
+          <w:szCs w:val="24"/>
+        </w:rPr>
+        <w:t xml:space="preserve"> }}</w:t>
       </w:r>
     </w:p>
     <w:p>
       <w:pPr>
         <w:rPr>
-          <w:rFonts w:ascii="Times New Roman" w:hAnsi="Times New Roman" w:cs="Times New Roman"/>
-          <w:sz w:val="24"/>
-          <w:szCs w:val="24"/>
-        </w:rPr>
-      </w:pPr>
-      <w:r>
-        <w:rPr>
-          <w:rFonts w:ascii="Times New Roman" w:hAnsi="Times New Roman" w:cs="Times New Roman"/>
-          <w:sz w:val="24"/>
-          <w:szCs w:val="24"/>
-        </w:rPr>
-        <w:t>I want the court to allow me and my child {{ child</w:t>
-      </w:r>
-      <w:r>
-        <w:rPr>
-          <w:rFonts w:ascii="Times New Roman" w:hAnsi="Times New Roman" w:cs="Times New Roman"/>
-          <w:sz w:val="24"/>
-          <w:szCs w:val="24"/>
-        </w:rPr>
-        <w:t>ren</w:t>
-      </w:r>
-      <w:r>
-        <w:rPr>
-          <w:rFonts w:ascii="Times New Roman" w:hAnsi="Times New Roman" w:cs="Times New Roman"/>
-          <w:sz w:val="24"/>
-          <w:szCs w:val="24"/>
-        </w:rPr>
-        <w:t>[0] }}, DOB: {{ child</w:t>
-      </w:r>
-      <w:r>
-        <w:rPr>
-          <w:rFonts w:ascii="Times New Roman" w:hAnsi="Times New Roman" w:cs="Times New Roman"/>
-          <w:sz w:val="24"/>
-          <w:szCs w:val="24"/>
-        </w:rPr>
-        <w:t>ren</w:t>
-      </w:r>
-      <w:r>
-        <w:rPr>
-          <w:rFonts w:ascii="Times New Roman" w:hAnsi="Times New Roman" w:cs="Times New Roman"/>
-          <w:sz w:val="24"/>
-          <w:szCs w:val="24"/>
-        </w:rPr>
-        <w:t>[0].</w:t>
-      </w:r>
-      <w:r>
-        <w:rPr>
-          <w:rFonts w:ascii="Times New Roman" w:hAnsi="Times New Roman" w:cs="Times New Roman"/>
-          <w:sz w:val="24"/>
-          <w:szCs w:val="24"/>
-        </w:rPr>
-        <w:t xml:space="preserve">birthdate </w:t>
-      </w:r>
-      <w:r>
-        <w:rPr>
-          <w:rFonts w:ascii="Times New Roman" w:hAnsi="Times New Roman" w:cs="Times New Roman"/>
-          <w:sz w:val="24"/>
-          <w:szCs w:val="24"/>
-        </w:rPr>
-        <w:t xml:space="preserve">}} to move because: {{ </w:t>
-      </w:r>
-      <w:r>
-        <w:rPr>
-          <w:rFonts w:ascii="Times New Roman" w:hAnsi="Times New Roman" w:cs="Times New Roman"/>
-          <w:sz w:val="24"/>
-          <w:szCs w:val="24"/>
-        </w:rPr>
-        <w:t>moving_reason</w:t>
-      </w:r>
-      <w:r>
-        <w:rPr>
-          <w:rFonts w:ascii="Times New Roman" w:hAnsi="Times New Roman" w:cs="Times New Roman"/>
-          <w:sz w:val="24"/>
-          <w:szCs w:val="24"/>
-        </w:rPr>
-        <w:t xml:space="preserve"> }}</w:t>
+          <w:sz w:val="24"/>
+          <w:szCs w:val="24"/>
+        </w:rPr>
+      </w:pPr>
+      <w:r>
+        <w:rPr>
+          <w:sz w:val="24"/>
+          <w:szCs w:val="24"/>
+        </w:rPr>
+        <w:t xml:space="preserve">The move will improve the quality of life for my child and me because: {{ </w:t>
+      </w:r>
+      <w:proofErr w:type="spellStart"/>
+      <w:r>
+        <w:rPr>
+          <w:sz w:val="24"/>
+          <w:szCs w:val="24"/>
+        </w:rPr>
+        <w:t>moving_benefits</w:t>
+      </w:r>
+      <w:proofErr w:type="spellEnd"/>
+      <w:r>
+        <w:rPr>
+          <w:sz w:val="24"/>
+          <w:szCs w:val="24"/>
+        </w:rPr>
+        <w:t xml:space="preserve"> </w:t>
+      </w:r>
+      <w:r>
+        <w:rPr>
+          <w:sz w:val="24"/>
+          <w:szCs w:val="24"/>
+        </w:rPr>
+        <w:t>}}</w:t>
       </w:r>
     </w:p>
     <w:p>
       <w:pPr>
         <w:rPr>
-          <w:rFonts w:ascii="Times New Roman" w:hAnsi="Times New Roman" w:cs="Times New Roman"/>
-          <w:sz w:val="24"/>
-          <w:szCs w:val="24"/>
-        </w:rPr>
-      </w:pPr>
-      <w:r>
-        <w:rPr>
-          <w:rFonts w:ascii="Times New Roman" w:hAnsi="Times New Roman" w:cs="Times New Roman"/>
-          <w:sz w:val="24"/>
-          <w:szCs w:val="24"/>
-        </w:rPr>
-        <w:t xml:space="preserve">The move will improve the quality of life for my child and me because: {{ </w:t>
-      </w:r>
-      <w:r>
-        <w:rPr>
-          <w:rFonts w:ascii="Times New Roman" w:hAnsi="Times New Roman" w:cs="Times New Roman"/>
-          <w:sz w:val="24"/>
-          <w:szCs w:val="24"/>
-        </w:rPr>
-        <w:t>moving_benefits</w:t>
-      </w:r>
-      <w:r>
-        <w:rPr>
-          <w:rFonts w:ascii="Times New Roman" w:hAnsi="Times New Roman" w:cs="Times New Roman"/>
+          <w:sz w:val="24"/>
+          <w:szCs w:val="24"/>
+        </w:rPr>
+      </w:pPr>
+      <w:r>
+        <w:rPr>
+          <w:sz w:val="24"/>
+          <w:szCs w:val="24"/>
+        </w:rPr>
+        <w:t xml:space="preserve">{% if </w:t>
+      </w:r>
+      <w:proofErr w:type="spellStart"/>
+      <w:r>
+        <w:rPr>
+          <w:sz w:val="24"/>
+          <w:szCs w:val="24"/>
+        </w:rPr>
+        <w:t>other_parent_opposition</w:t>
+      </w:r>
+      <w:proofErr w:type="spellEnd"/>
+      <w:r>
+        <w:rPr>
+          <w:sz w:val="24"/>
+          <w:szCs w:val="24"/>
+        </w:rPr>
+        <w:t xml:space="preserve"> == “I don’t know” %} </w:t>
+      </w:r>
+      <w:r>
+        <w:rPr>
+          <w:sz w:val="24"/>
+          <w:szCs w:val="24"/>
+        </w:rPr>
+        <w:br/>
+      </w:r>
+      <w:r>
+        <w:rPr>
+          <w:sz w:val="24"/>
+          <w:szCs w:val="24"/>
+        </w:rPr>
+        <w:t xml:space="preserve">I don’t know whether {{ </w:t>
+      </w:r>
+      <w:proofErr w:type="spellStart"/>
+      <w:r>
+        <w:rPr>
+          <w:sz w:val="24"/>
+          <w:szCs w:val="24"/>
+        </w:rPr>
+        <w:t>other_parties</w:t>
+      </w:r>
+      <w:proofErr w:type="spellEnd"/>
+      <w:r>
+        <w:rPr>
+          <w:sz w:val="24"/>
+          <w:szCs w:val="24"/>
+        </w:rPr>
+        <w:t xml:space="preserve">[0] }} opposes the move. </w:t>
+      </w:r>
+      <w:r>
+        <w:rPr>
+          <w:sz w:val="24"/>
+          <w:szCs w:val="24"/>
+        </w:rPr>
+        <w:br/>
+      </w:r>
+      <w:r>
+        <w:rPr>
+          <w:sz w:val="24"/>
+          <w:szCs w:val="24"/>
+        </w:rPr>
+        <w:t xml:space="preserve">{% </w:t>
+      </w:r>
+      <w:proofErr w:type="spellStart"/>
+      <w:r>
+        <w:rPr>
+          <w:sz w:val="24"/>
+          <w:szCs w:val="24"/>
+        </w:rPr>
+        <w:t>elif</w:t>
+      </w:r>
+      <w:proofErr w:type="spellEnd"/>
+      <w:r>
+        <w:rPr>
           <w:sz w:val="24"/>
           <w:szCs w:val="24"/>
         </w:rPr>
         <w:t xml:space="preserve"> </w:t>
       </w:r>
-      <w:r>
-        <w:rPr>
-          <w:rFonts w:ascii="Times New Roman" w:hAnsi="Times New Roman" w:cs="Times New Roman"/>
-          <w:sz w:val="24"/>
-          <w:szCs w:val="24"/>
-        </w:rPr>
-        <w:t>}}</w:t>
+      <w:proofErr w:type="spellStart"/>
+      <w:r>
+        <w:rPr>
+          <w:sz w:val="24"/>
+          <w:szCs w:val="24"/>
+        </w:rPr>
+        <w:t>other_parent_opposition</w:t>
+      </w:r>
+      <w:proofErr w:type="spellEnd"/>
+      <w:r>
+        <w:rPr>
+          <w:sz w:val="24"/>
+          <w:szCs w:val="24"/>
+        </w:rPr>
+        <w:t xml:space="preserve"> == “No” %} </w:t>
+      </w:r>
+      <w:r>
+        <w:rPr>
+          <w:sz w:val="24"/>
+          <w:szCs w:val="24"/>
+        </w:rPr>
+        <w:br/>
+      </w:r>
+      <w:r>
+        <w:rPr>
+          <w:sz w:val="24"/>
+          <w:szCs w:val="24"/>
+        </w:rPr>
+        <w:t>{{</w:t>
+      </w:r>
+      <w:r>
+        <w:t xml:space="preserve"> </w:t>
+      </w:r>
+      <w:proofErr w:type="spellStart"/>
+      <w:r>
+        <w:rPr>
+          <w:sz w:val="24"/>
+          <w:szCs w:val="24"/>
+        </w:rPr>
+        <w:t>other_parties</w:t>
+      </w:r>
+      <w:proofErr w:type="spellEnd"/>
+      <w:r>
+        <w:rPr>
+          <w:sz w:val="24"/>
+          <w:szCs w:val="24"/>
+        </w:rPr>
+        <w:t xml:space="preserve">[0] }} does not oppose the move.  </w:t>
+      </w:r>
+      <w:r>
+        <w:rPr>
+          <w:sz w:val="24"/>
+          <w:szCs w:val="24"/>
+        </w:rPr>
+        <w:br/>
+      </w:r>
+      <w:r>
+        <w:rPr>
+          <w:sz w:val="24"/>
+          <w:szCs w:val="24"/>
+        </w:rPr>
+        <w:t xml:space="preserve">{% </w:t>
+      </w:r>
+      <w:proofErr w:type="spellStart"/>
+      <w:r>
+        <w:rPr>
+          <w:sz w:val="24"/>
+          <w:szCs w:val="24"/>
+        </w:rPr>
+        <w:t>elif</w:t>
+      </w:r>
+      <w:proofErr w:type="spellEnd"/>
+      <w:r>
+        <w:rPr>
+          <w:sz w:val="24"/>
+          <w:szCs w:val="24"/>
+        </w:rPr>
+        <w:t xml:space="preserve"> </w:t>
+      </w:r>
+      <w:proofErr w:type="spellStart"/>
+      <w:r>
+        <w:rPr>
+          <w:sz w:val="24"/>
+          <w:szCs w:val="24"/>
+        </w:rPr>
+        <w:t>other_parent_opposition</w:t>
+      </w:r>
+      <w:proofErr w:type="spellEnd"/>
+      <w:r>
+        <w:rPr>
+          <w:sz w:val="24"/>
+          <w:szCs w:val="24"/>
+        </w:rPr>
+        <w:t xml:space="preserve"> == “Yes” %} </w:t>
+      </w:r>
+      <w:r>
+        <w:rPr>
+          <w:sz w:val="24"/>
+          <w:szCs w:val="24"/>
+        </w:rPr>
+        <w:br/>
+      </w:r>
+      <w:r>
+        <w:rPr>
+          <w:sz w:val="24"/>
+          <w:szCs w:val="24"/>
+        </w:rPr>
+        <w:t xml:space="preserve">{{ </w:t>
+      </w:r>
+      <w:proofErr w:type="spellStart"/>
+      <w:r>
+        <w:rPr>
+          <w:sz w:val="24"/>
+          <w:szCs w:val="24"/>
+        </w:rPr>
+        <w:t>other_parties</w:t>
+      </w:r>
+      <w:proofErr w:type="spellEnd"/>
+      <w:r>
+        <w:rPr>
+          <w:sz w:val="24"/>
+          <w:szCs w:val="24"/>
+        </w:rPr>
+        <w:t xml:space="preserve">[0] }} opposes the move.  </w:t>
+      </w:r>
+      <w:r>
+        <w:rPr>
+          <w:sz w:val="24"/>
+          <w:szCs w:val="24"/>
+        </w:rPr>
+        <w:br/>
+      </w:r>
+      <w:r>
+        <w:rPr>
+          <w:sz w:val="24"/>
+          <w:szCs w:val="24"/>
+        </w:rPr>
+        <w:t>{% endif %}</w:t>
       </w:r>
     </w:p>
     <w:p>
       <w:pPr>
         <w:rPr>
-          <w:rFonts w:ascii="Times New Roman" w:hAnsi="Times New Roman" w:cs="Times New Roman"/>
-          <w:sz w:val="24"/>
-          <w:szCs w:val="24"/>
-        </w:rPr>
-      </w:pPr>
-      <w:r>
-        <w:rPr>
-          <w:rFonts w:ascii="Times New Roman" w:hAnsi="Times New Roman" w:cs="Times New Roman"/>
-          <w:sz w:val="24"/>
-          <w:szCs w:val="24"/>
-        </w:rPr>
-        <w:t xml:space="preserve">{% if </w:t>
-      </w:r>
-      <w:r>
-        <w:rPr>
-          <w:rFonts w:ascii="Times New Roman" w:hAnsi="Times New Roman" w:cs="Times New Roman"/>
-          <w:sz w:val="24"/>
-          <w:szCs w:val="24"/>
-        </w:rPr>
-        <w:t>other_parent_opposition</w:t>
-      </w:r>
-      <w:r>
-        <w:rPr>
-          <w:rFonts w:ascii="Times New Roman" w:hAnsi="Times New Roman" w:cs="Times New Roman"/>
-          <w:sz w:val="24"/>
-          <w:szCs w:val="24"/>
-        </w:rPr>
-        <w:t xml:space="preserve"> == “I don’t know” %} </w:t>
-      </w:r>
-      <w:r>
-        <w:rPr>
-          <w:rFonts w:ascii="Times New Roman" w:hAnsi="Times New Roman" w:cs="Times New Roman"/>
-          <w:sz w:val="24"/>
-          <w:szCs w:val="24"/>
-        </w:rPr>
-        <w:br/>
-      </w:r>
-      <w:r>
-        <w:rPr>
-          <w:rFonts w:ascii="Times New Roman" w:hAnsi="Times New Roman" w:cs="Times New Roman"/>
-          <w:sz w:val="24"/>
-          <w:szCs w:val="24"/>
-        </w:rPr>
-        <w:t xml:space="preserve">I don’t know whether </w:t>
-      </w:r>
-      <w:r>
-        <w:rPr>
-          <w:rFonts w:ascii="Times New Roman" w:hAnsi="Times New Roman" w:cs="Times New Roman"/>
-          <w:sz w:val="24"/>
-          <w:szCs w:val="24"/>
-        </w:rPr>
-        <w:t xml:space="preserve">{{ other_parties[0] }} </w:t>
-      </w:r>
-      <w:r>
-        <w:rPr>
-          <w:rFonts w:ascii="Times New Roman" w:hAnsi="Times New Roman" w:cs="Times New Roman"/>
-          <w:sz w:val="24"/>
-          <w:szCs w:val="24"/>
-        </w:rPr>
-        <w:t>opposes the move.</w:t>
-      </w:r>
-      <w:r>
-        <w:rPr>
-          <w:rFonts w:ascii="Times New Roman" w:hAnsi="Times New Roman" w:cs="Times New Roman"/>
-          <w:sz w:val="24"/>
-          <w:szCs w:val="24"/>
-        </w:rPr>
-        <w:t xml:space="preserve"> </w:t>
-      </w:r>
-      <w:r>
-        <w:rPr>
-          <w:rFonts w:ascii="Times New Roman" w:hAnsi="Times New Roman" w:cs="Times New Roman"/>
-          <w:sz w:val="24"/>
-          <w:szCs w:val="24"/>
-        </w:rPr>
-        <w:br/>
-      </w:r>
-      <w:r>
-        <w:rPr>
-          <w:rFonts w:ascii="Times New Roman" w:hAnsi="Times New Roman" w:cs="Times New Roman"/>
-          <w:sz w:val="24"/>
-          <w:szCs w:val="24"/>
-        </w:rPr>
-        <w:t xml:space="preserve">{% elif other_parent_opposition == “No” %} </w:t>
-      </w:r>
-      <w:r>
-        <w:rPr>
-          <w:rFonts w:ascii="Times New Roman" w:hAnsi="Times New Roman" w:cs="Times New Roman"/>
-          <w:sz w:val="24"/>
-          <w:szCs w:val="24"/>
-        </w:rPr>
-        <w:br/>
-      </w:r>
-      <w:r>
-        <w:rPr>
-          <w:rFonts w:ascii="Times New Roman" w:hAnsi="Times New Roman" w:cs="Times New Roman"/>
-          <w:sz w:val="24"/>
-          <w:szCs w:val="24"/>
-        </w:rPr>
-        <w:t>{{</w:t>
-      </w:r>
-      <w:r>
-        <w:t xml:space="preserve"> </w:t>
-      </w:r>
-      <w:r>
-        <w:rPr>
-          <w:rFonts w:ascii="Times New Roman" w:hAnsi="Times New Roman" w:cs="Times New Roman"/>
-          <w:sz w:val="24"/>
-          <w:szCs w:val="24"/>
-        </w:rPr>
-        <w:t>other_parties[0] }}</w:t>
-      </w:r>
-      <w:r>
-        <w:rPr>
-          <w:rFonts w:ascii="Times New Roman" w:hAnsi="Times New Roman" w:cs="Times New Roman"/>
-          <w:sz w:val="24"/>
-          <w:szCs w:val="24"/>
-        </w:rPr>
-        <w:t xml:space="preserve"> does not oppose the move.  </w:t>
-      </w:r>
-      <w:r>
-        <w:rPr>
-          <w:rFonts w:ascii="Times New Roman" w:hAnsi="Times New Roman" w:cs="Times New Roman"/>
-          <w:sz w:val="24"/>
-          <w:szCs w:val="24"/>
-        </w:rPr>
-        <w:br/>
-      </w:r>
-      <w:r>
-        <w:rPr>
-          <w:rFonts w:ascii="Times New Roman" w:hAnsi="Times New Roman" w:cs="Times New Roman"/>
-          <w:sz w:val="24"/>
-          <w:szCs w:val="24"/>
-        </w:rPr>
-        <w:t xml:space="preserve">{% elif </w:t>
-      </w:r>
-      <w:r>
-        <w:rPr>
-          <w:rFonts w:ascii="Times New Roman" w:hAnsi="Times New Roman" w:cs="Times New Roman"/>
-          <w:sz w:val="24"/>
-          <w:szCs w:val="24"/>
-        </w:rPr>
-        <w:t>other_parent_opposition == “</w:t>
-      </w:r>
-      <w:r>
-        <w:rPr>
-          <w:rFonts w:ascii="Times New Roman" w:hAnsi="Times New Roman" w:cs="Times New Roman"/>
-          <w:sz w:val="24"/>
-          <w:szCs w:val="24"/>
-        </w:rPr>
-        <w:t>Yes</w:t>
-      </w:r>
-      <w:r>
-        <w:rPr>
-          <w:rFonts w:ascii="Times New Roman" w:hAnsi="Times New Roman" w:cs="Times New Roman"/>
-          <w:sz w:val="24"/>
-          <w:szCs w:val="24"/>
-        </w:rPr>
-        <w:t>” %}</w:t>
-      </w:r>
-      <w:r>
-        <w:rPr>
-          <w:rFonts w:ascii="Times New Roman" w:hAnsi="Times New Roman" w:cs="Times New Roman"/>
-          <w:sz w:val="24"/>
-          <w:szCs w:val="24"/>
-        </w:rPr>
-        <w:t xml:space="preserve"> </w:t>
-      </w:r>
-      <w:r>
-        <w:rPr>
-          <w:rFonts w:ascii="Times New Roman" w:hAnsi="Times New Roman" w:cs="Times New Roman"/>
-          <w:sz w:val="24"/>
-          <w:szCs w:val="24"/>
-        </w:rPr>
-        <w:br/>
-      </w:r>
-      <w:r>
-        <w:rPr>
-          <w:rFonts w:ascii="Times New Roman" w:hAnsi="Times New Roman" w:cs="Times New Roman"/>
-          <w:sz w:val="24"/>
-          <w:szCs w:val="24"/>
-        </w:rPr>
-        <w:t>{{ other_parties[0] }} oppose</w:t>
-      </w:r>
-      <w:r>
-        <w:rPr>
-          <w:rFonts w:ascii="Times New Roman" w:hAnsi="Times New Roman" w:cs="Times New Roman"/>
-          <w:sz w:val="24"/>
-          <w:szCs w:val="24"/>
-        </w:rPr>
-        <w:t>s</w:t>
-      </w:r>
-      <w:r>
-        <w:rPr>
-          <w:rFonts w:ascii="Times New Roman" w:hAnsi="Times New Roman" w:cs="Times New Roman"/>
-          <w:sz w:val="24"/>
-          <w:szCs w:val="24"/>
-        </w:rPr>
-        <w:t xml:space="preserve"> the move</w:t>
-      </w:r>
-      <w:r>
-        <w:rPr>
-          <w:rFonts w:ascii="Times New Roman" w:hAnsi="Times New Roman" w:cs="Times New Roman"/>
-          <w:sz w:val="24"/>
-          <w:szCs w:val="24"/>
-        </w:rPr>
-        <w:t xml:space="preserve">.  </w:t>
-      </w:r>
-      <w:r>
-        <w:rPr>
-          <w:rFonts w:ascii="Times New Roman" w:hAnsi="Times New Roman" w:cs="Times New Roman"/>
-          <w:sz w:val="24"/>
-          <w:szCs w:val="24"/>
-        </w:rPr>
-        <w:br/>
-      </w:r>
-      <w:r>
-        <w:rPr>
-          <w:rFonts w:ascii="Times New Roman" w:hAnsi="Times New Roman" w:cs="Times New Roman"/>
-          <w:sz w:val="24"/>
-          <w:szCs w:val="24"/>
-        </w:rPr>
-        <w:t>{% endif %}</w:t>
+          <w:sz w:val="24"/>
+          <w:szCs w:val="24"/>
+        </w:rPr>
+      </w:pPr>
+      <w:r>
+        <w:rPr>
+          <w:i/>
+          <w:iCs/>
+          <w:sz w:val="24"/>
+          <w:szCs w:val="24"/>
+        </w:rPr>
+        <w:t>Need block about reason for opposition being child support mods</w:t>
       </w:r>
     </w:p>
     <w:p>
       <w:pPr>
         <w:rPr>
-          <w:rFonts w:ascii="Times New Roman" w:hAnsi="Times New Roman" w:cs="Times New Roman"/>
-          <w:sz w:val="24"/>
-          <w:szCs w:val="24"/>
-        </w:rPr>
-      </w:pPr>
-      <w:r>
-        <w:rPr>
-          <w:rFonts w:ascii="Times New Roman" w:hAnsi="Times New Roman" w:cs="Times New Roman"/>
-          <w:i/>
-          <w:iCs/>
-          <w:sz w:val="24"/>
-          <w:szCs w:val="24"/>
-        </w:rPr>
-        <w:t>Need block about reason for opposition being child support mods</w:t>
+          <w:sz w:val="24"/>
+          <w:szCs w:val="24"/>
+        </w:rPr>
+      </w:pPr>
+      <w:r>
+        <w:rPr>
+          <w:sz w:val="24"/>
+          <w:szCs w:val="24"/>
+        </w:rPr>
+        <w:t xml:space="preserve">{% if </w:t>
+      </w:r>
+      <w:proofErr w:type="spellStart"/>
+      <w:r>
+        <w:rPr>
+          <w:sz w:val="24"/>
+          <w:szCs w:val="24"/>
+        </w:rPr>
+        <w:t>domestic_violence</w:t>
+      </w:r>
+      <w:proofErr w:type="spellEnd"/>
+      <w:r>
+        <w:rPr>
+          <w:sz w:val="24"/>
+          <w:szCs w:val="24"/>
+        </w:rPr>
+        <w:t xml:space="preserve"> == True %}</w:t>
+      </w:r>
+      <w:r>
+        <w:rPr>
+          <w:sz w:val="24"/>
+          <w:szCs w:val="24"/>
+        </w:rPr>
+        <w:br/>
+      </w:r>
+      <w:r>
+        <w:rPr>
+          <w:sz w:val="24"/>
+          <w:szCs w:val="24"/>
+        </w:rPr>
+        <w:t xml:space="preserve">I am moving to </w:t>
+      </w:r>
+      <w:proofErr w:type="spellStart"/>
+      <w:r>
+        <w:rPr>
+          <w:sz w:val="24"/>
+          <w:szCs w:val="24"/>
+        </w:rPr>
+        <w:t>espcape</w:t>
+      </w:r>
+      <w:proofErr w:type="spellEnd"/>
+      <w:r>
+        <w:rPr>
+          <w:sz w:val="24"/>
+          <w:szCs w:val="24"/>
+        </w:rPr>
+        <w:t xml:space="preserve"> domestic violence by {{ </w:t>
+      </w:r>
+      <w:proofErr w:type="spellStart"/>
+      <w:r>
+        <w:rPr>
+          <w:sz w:val="24"/>
+          <w:szCs w:val="24"/>
+        </w:rPr>
+        <w:t>other_parties</w:t>
+      </w:r>
+      <w:proofErr w:type="spellEnd"/>
+      <w:r>
+        <w:rPr>
+          <w:sz w:val="24"/>
+          <w:szCs w:val="24"/>
+        </w:rPr>
+        <w:t xml:space="preserve">[0] }}.  A brief summary of what {{ </w:t>
+      </w:r>
+      <w:proofErr w:type="spellStart"/>
+      <w:r>
+        <w:rPr>
+          <w:sz w:val="24"/>
+          <w:szCs w:val="24"/>
+        </w:rPr>
+        <w:t>other_parties</w:t>
+      </w:r>
+      <w:proofErr w:type="spellEnd"/>
+      <w:r>
+        <w:rPr>
+          <w:sz w:val="24"/>
+          <w:szCs w:val="24"/>
+        </w:rPr>
+        <w:t xml:space="preserve">[0] }} did to me follows: {{ </w:t>
+      </w:r>
+      <w:proofErr w:type="spellStart"/>
+      <w:r>
+        <w:rPr>
+          <w:sz w:val="24"/>
+          <w:szCs w:val="24"/>
+        </w:rPr>
+        <w:t>domestic_violence_exp</w:t>
+      </w:r>
+      <w:proofErr w:type="spellEnd"/>
+      <w:r>
+        <w:rPr>
+          <w:sz w:val="24"/>
+          <w:szCs w:val="24"/>
+        </w:rPr>
+        <w:t xml:space="preserve"> }}</w:t>
+      </w:r>
+      <w:r>
+        <w:rPr>
+          <w:sz w:val="24"/>
+          <w:szCs w:val="24"/>
+        </w:rPr>
+        <w:br/>
+        <w:t>{% endif %}</w:t>
       </w:r>
     </w:p>
     <w:p>
       <w:pPr>
         <w:rPr>
-          <w:rFonts w:ascii="Times New Roman" w:hAnsi="Times New Roman" w:cs="Times New Roman"/>
-          <w:sz w:val="24"/>
-          <w:szCs w:val="24"/>
-        </w:rPr>
-      </w:pPr>
-      <w:r>
-        <w:rPr>
-          <w:rFonts w:ascii="Times New Roman" w:hAnsi="Times New Roman" w:cs="Times New Roman"/>
-          <w:sz w:val="24"/>
-          <w:szCs w:val="24"/>
-        </w:rPr>
-        <w:t xml:space="preserve">{% if </w:t>
-      </w:r>
-      <w:r>
-        <w:rPr>
-          <w:rFonts w:ascii="Times New Roman" w:hAnsi="Times New Roman" w:cs="Times New Roman"/>
-          <w:sz w:val="24"/>
-          <w:szCs w:val="24"/>
-        </w:rPr>
-        <w:t>domestic_violence</w:t>
-      </w:r>
-      <w:r>
-        <w:rPr>
-          <w:rFonts w:ascii="Times New Roman" w:hAnsi="Times New Roman" w:cs="Times New Roman"/>
-          <w:sz w:val="24"/>
-          <w:szCs w:val="24"/>
-        </w:rPr>
-        <w:t xml:space="preserve"> == True %}</w:t>
-      </w:r>
-      <w:r>
-        <w:rPr>
-          <w:rFonts w:ascii="Times New Roman" w:hAnsi="Times New Roman" w:cs="Times New Roman"/>
-          <w:sz w:val="24"/>
-          <w:szCs w:val="24"/>
-        </w:rPr>
-        <w:br/>
-      </w:r>
-      <w:r>
-        <w:rPr>
-          <w:rFonts w:ascii="Times New Roman" w:hAnsi="Times New Roman" w:cs="Times New Roman"/>
-          <w:sz w:val="24"/>
-          <w:szCs w:val="24"/>
-        </w:rPr>
-        <w:t>I am moving to espcape domestic violence by {{ other_parties[0] }}.  A brief summary of what {{ other_parties[0] }} did to me follows: {{ domestic_violence_exp }}</w:t>
-      </w:r>
-      <w:r>
-        <w:rPr>
-          <w:rFonts w:ascii="Times New Roman" w:hAnsi="Times New Roman" w:cs="Times New Roman"/>
-          <w:sz w:val="24"/>
-          <w:szCs w:val="24"/>
-        </w:rPr>
-        <w:br/>
-        <w:t>{% endif %}</w:t>
+          <w:sz w:val="24"/>
+          <w:szCs w:val="24"/>
+        </w:rPr>
+      </w:pPr>
+      <w:r>
+        <w:rPr>
+          <w:sz w:val="24"/>
+          <w:szCs w:val="24"/>
+        </w:rPr>
+        <w:t>Paragraph 4:</w:t>
       </w:r>
     </w:p>
     <w:p>
       <w:pPr>
         <w:rPr>
-          <w:rFonts w:ascii="Times New Roman" w:hAnsi="Times New Roman" w:cs="Times New Roman"/>
-          <w:b/>
-          <w:bCs/>
-          <w:sz w:val="24"/>
-          <w:szCs w:val="24"/>
-        </w:rPr>
-      </w:pPr>
-      <w:r>
-        <w:rPr>
-          <w:rFonts w:ascii="Times New Roman" w:hAnsi="Times New Roman" w:cs="Times New Roman"/>
-          <w:b/>
-          <w:bCs/>
-          <w:sz w:val="24"/>
-          <w:szCs w:val="24"/>
-        </w:rPr>
-        <w:t>Paragraph 4:</w:t>
+          <w:sz w:val="24"/>
+          <w:szCs w:val="24"/>
+        </w:rPr>
+      </w:pPr>
+      <w:r>
+        <w:rPr>
+          <w:sz w:val="24"/>
+          <w:szCs w:val="24"/>
+        </w:rPr>
+        <w:t>I want to move the legal residence of my child {{ child</w:t>
+      </w:r>
+      <w:r>
+        <w:rPr>
+          <w:sz w:val="24"/>
+          <w:szCs w:val="24"/>
+        </w:rPr>
+        <w:t>ren</w:t>
+      </w:r>
+      <w:r>
+        <w:rPr>
+          <w:sz w:val="24"/>
+          <w:szCs w:val="24"/>
+        </w:rPr>
+        <w:t>[0] }}, DOB: {{ child</w:t>
+      </w:r>
+      <w:r>
+        <w:rPr>
+          <w:sz w:val="24"/>
+          <w:szCs w:val="24"/>
+        </w:rPr>
+        <w:t>ren</w:t>
+      </w:r>
+      <w:r>
+        <w:rPr>
+          <w:sz w:val="24"/>
+          <w:szCs w:val="24"/>
+        </w:rPr>
+        <w:t>[0].</w:t>
+      </w:r>
+      <w:r>
+        <w:rPr>
+          <w:sz w:val="24"/>
+          <w:szCs w:val="24"/>
+        </w:rPr>
+        <w:t>birthdate</w:t>
+      </w:r>
+      <w:r>
+        <w:rPr>
+          <w:sz w:val="24"/>
+          <w:szCs w:val="24"/>
+        </w:rPr>
+        <w:t xml:space="preserve"> }} to {{ </w:t>
+      </w:r>
+      <w:proofErr w:type="spellStart"/>
+      <w:r>
+        <w:rPr>
+          <w:sz w:val="24"/>
+          <w:szCs w:val="24"/>
+        </w:rPr>
+        <w:t>new_address</w:t>
+      </w:r>
+      <w:proofErr w:type="spellEnd"/>
+      <w:r>
+        <w:rPr>
+          <w:sz w:val="24"/>
+          <w:szCs w:val="24"/>
+        </w:rPr>
+        <w:t>[0]</w:t>
+      </w:r>
+      <w:r>
+        <w:rPr>
+          <w:sz w:val="24"/>
+          <w:szCs w:val="24"/>
+        </w:rPr>
+        <w:t xml:space="preserve"> }}.</w:t>
       </w:r>
     </w:p>
     <w:p>
       <w:pPr>
         <w:rPr>
-          <w:rFonts w:ascii="Times New Roman" w:hAnsi="Times New Roman" w:cs="Times New Roman"/>
-          <w:sz w:val="24"/>
-          <w:szCs w:val="24"/>
-        </w:rPr>
-      </w:pPr>
-      <w:r>
-        <w:rPr>
-          <w:rFonts w:ascii="Times New Roman" w:hAnsi="Times New Roman" w:cs="Times New Roman"/>
-          <w:sz w:val="24"/>
-          <w:szCs w:val="24"/>
-        </w:rPr>
-        <w:t>I want to move the legal residence of my child {{ child</w:t>
-      </w:r>
-      <w:r>
-        <w:rPr>
-          <w:rFonts w:ascii="Times New Roman" w:hAnsi="Times New Roman" w:cs="Times New Roman"/>
-          <w:sz w:val="24"/>
-          <w:szCs w:val="24"/>
-        </w:rPr>
-        <w:t>ren</w:t>
-      </w:r>
-      <w:r>
-        <w:rPr>
-          <w:rFonts w:ascii="Times New Roman" w:hAnsi="Times New Roman" w:cs="Times New Roman"/>
-          <w:sz w:val="24"/>
-          <w:szCs w:val="24"/>
-        </w:rPr>
-        <w:t>[0] }}, DOB: {{ child</w:t>
-      </w:r>
-      <w:r>
-        <w:rPr>
-          <w:rFonts w:ascii="Times New Roman" w:hAnsi="Times New Roman" w:cs="Times New Roman"/>
-          <w:sz w:val="24"/>
-          <w:szCs w:val="24"/>
-        </w:rPr>
-        <w:t>ren</w:t>
-      </w:r>
-      <w:r>
-        <w:rPr>
-          <w:rFonts w:ascii="Times New Roman" w:hAnsi="Times New Roman" w:cs="Times New Roman"/>
-          <w:sz w:val="24"/>
-          <w:szCs w:val="24"/>
-        </w:rPr>
-        <w:t>[0].</w:t>
-      </w:r>
-      <w:r>
-        <w:rPr>
-          <w:rFonts w:ascii="Times New Roman" w:hAnsi="Times New Roman" w:cs="Times New Roman"/>
-          <w:sz w:val="24"/>
-          <w:szCs w:val="24"/>
-        </w:rPr>
-        <w:t>birthdate</w:t>
-      </w:r>
-      <w:r>
-        <w:rPr>
-          <w:rFonts w:ascii="Times New Roman" w:hAnsi="Times New Roman" w:cs="Times New Roman"/>
-          <w:sz w:val="24"/>
-          <w:szCs w:val="24"/>
-        </w:rPr>
-        <w:t xml:space="preserve"> }} to {{ </w:t>
-      </w:r>
-      <w:r>
-        <w:rPr>
-          <w:rFonts w:ascii="Times New Roman" w:hAnsi="Times New Roman" w:cs="Times New Roman"/>
-          <w:sz w:val="24"/>
-          <w:szCs w:val="24"/>
-        </w:rPr>
-        <w:t>new_address</w:t>
-      </w:r>
-      <w:r>
-        <w:rPr>
-          <w:rFonts w:ascii="Times New Roman" w:hAnsi="Times New Roman" w:cs="Times New Roman"/>
-          <w:sz w:val="24"/>
-          <w:szCs w:val="24"/>
-        </w:rPr>
-        <w:t>[0]</w:t>
-      </w:r>
-      <w:r>
-        <w:rPr>
-          <w:rFonts w:ascii="Times New Roman" w:hAnsi="Times New Roman" w:cs="Times New Roman"/>
+          <w:sz w:val="24"/>
+          <w:szCs w:val="24"/>
+        </w:rPr>
+      </w:pPr>
+      <w:r>
+        <w:rPr>
+          <w:sz w:val="24"/>
+          <w:szCs w:val="24"/>
+        </w:rPr>
+        <w:t xml:space="preserve">I am asking the court to allow me to move by {{ </w:t>
+      </w:r>
+      <w:proofErr w:type="spellStart"/>
+      <w:r>
+        <w:rPr>
+          <w:sz w:val="24"/>
+          <w:szCs w:val="24"/>
+        </w:rPr>
+        <w:t>mov</w:t>
+      </w:r>
+      <w:r>
+        <w:rPr>
+          <w:sz w:val="24"/>
+          <w:szCs w:val="24"/>
+        </w:rPr>
+        <w:t>ing</w:t>
+      </w:r>
+      <w:r>
+        <w:rPr>
+          <w:sz w:val="24"/>
+          <w:szCs w:val="24"/>
+        </w:rPr>
+        <w:t>_date</w:t>
+      </w:r>
+      <w:proofErr w:type="spellEnd"/>
+      <w:r>
+        <w:rPr>
           <w:sz w:val="24"/>
           <w:szCs w:val="24"/>
         </w:rPr>
@@ -940,118 +1023,89 @@
     <w:p>
       <w:pPr>
         <w:rPr>
-          <w:rFonts w:ascii="Times New Roman" w:hAnsi="Times New Roman" w:cs="Times New Roman"/>
-          <w:sz w:val="24"/>
-          <w:szCs w:val="24"/>
-        </w:rPr>
-      </w:pPr>
-      <w:r>
-        <w:rPr>
-          <w:rFonts w:ascii="Times New Roman" w:hAnsi="Times New Roman" w:cs="Times New Roman"/>
-          <w:sz w:val="24"/>
-          <w:szCs w:val="24"/>
-        </w:rPr>
-        <w:t>I am asking the court to allow me to move by {{ mov</w:t>
-      </w:r>
-      <w:r>
-        <w:rPr>
-          <w:rFonts w:ascii="Times New Roman" w:hAnsi="Times New Roman" w:cs="Times New Roman"/>
-          <w:sz w:val="24"/>
-          <w:szCs w:val="24"/>
-        </w:rPr>
-        <w:t>ing</w:t>
-      </w:r>
-      <w:r>
-        <w:rPr>
-          <w:rFonts w:ascii="Times New Roman" w:hAnsi="Times New Roman" w:cs="Times New Roman"/>
-          <w:sz w:val="24"/>
-          <w:szCs w:val="24"/>
-        </w:rPr>
-        <w:t>_date }}.</w:t>
+          <w:sz w:val="24"/>
+          <w:szCs w:val="24"/>
+        </w:rPr>
+      </w:pPr>
+      <w:r>
+        <w:rPr>
+          <w:sz w:val="24"/>
+          <w:szCs w:val="24"/>
+        </w:rPr>
+        <w:t xml:space="preserve">{% if </w:t>
+      </w:r>
+      <w:proofErr w:type="spellStart"/>
+      <w:r>
+        <w:rPr>
+          <w:sz w:val="24"/>
+          <w:szCs w:val="24"/>
+        </w:rPr>
+        <w:t>wants_parenting_time_change</w:t>
+      </w:r>
+      <w:proofErr w:type="spellEnd"/>
+      <w:r>
+        <w:rPr>
+          <w:sz w:val="24"/>
+          <w:szCs w:val="24"/>
+        </w:rPr>
+        <w:t xml:space="preserve"> == True %}</w:t>
       </w:r>
     </w:p>
     <w:p>
       <w:pPr>
         <w:rPr>
-          <w:rFonts w:ascii="Times New Roman" w:hAnsi="Times New Roman" w:cs="Times New Roman"/>
-          <w:sz w:val="24"/>
-          <w:szCs w:val="24"/>
-        </w:rPr>
-      </w:pPr>
-      <w:r>
-        <w:rPr>
-          <w:rFonts w:ascii="Times New Roman" w:hAnsi="Times New Roman" w:cs="Times New Roman"/>
-          <w:sz w:val="24"/>
-          <w:szCs w:val="24"/>
-        </w:rPr>
-        <w:t xml:space="preserve">{% if </w:t>
-      </w:r>
-      <w:r>
-        <w:rPr>
-          <w:rFonts w:ascii="Times New Roman" w:hAnsi="Times New Roman" w:cs="Times New Roman"/>
-          <w:sz w:val="24"/>
-          <w:szCs w:val="24"/>
-        </w:rPr>
-        <w:t>wants_parenting_time_change</w:t>
-      </w:r>
-      <w:r>
-        <w:rPr>
-          <w:rFonts w:ascii="Times New Roman" w:hAnsi="Times New Roman" w:cs="Times New Roman"/>
-          <w:sz w:val="24"/>
-          <w:szCs w:val="24"/>
-        </w:rPr>
-        <w:t xml:space="preserve"> == True %}</w:t>
+          <w:sz w:val="24"/>
+          <w:szCs w:val="24"/>
+        </w:rPr>
+      </w:pPr>
+      <w:r>
+        <w:rPr>
+          <w:sz w:val="24"/>
+          <w:szCs w:val="24"/>
+        </w:rPr>
+        <w:t>Paragraph 5:</w:t>
       </w:r>
     </w:p>
     <w:p>
       <w:pPr>
         <w:rPr>
-          <w:rFonts w:ascii="Times New Roman" w:hAnsi="Times New Roman" w:cs="Times New Roman"/>
-          <w:b/>
-          <w:bCs/>
-          <w:sz w:val="24"/>
-          <w:szCs w:val="24"/>
-        </w:rPr>
-      </w:pPr>
-      <w:r>
-        <w:rPr>
-          <w:rFonts w:ascii="Times New Roman" w:hAnsi="Times New Roman" w:cs="Times New Roman"/>
-          <w:b/>
-          <w:bCs/>
-          <w:sz w:val="24"/>
-          <w:szCs w:val="24"/>
-        </w:rPr>
-        <w:t>Paragraph 5:</w:t>
+          <w:sz w:val="24"/>
+          <w:szCs w:val="24"/>
+        </w:rPr>
+      </w:pPr>
+      <w:r>
+        <w:rPr>
+          <w:sz w:val="24"/>
+          <w:szCs w:val="24"/>
+        </w:rPr>
+        <w:t xml:space="preserve">My proposed new parenting time arrangements are: {{ </w:t>
+      </w:r>
+      <w:proofErr w:type="spellStart"/>
+      <w:r>
+        <w:rPr>
+          <w:sz w:val="24"/>
+          <w:szCs w:val="24"/>
+        </w:rPr>
+        <w:t>requested_order</w:t>
+      </w:r>
+      <w:proofErr w:type="spellEnd"/>
+      <w:r>
+        <w:rPr>
+          <w:sz w:val="24"/>
+          <w:szCs w:val="24"/>
+        </w:rPr>
+        <w:t xml:space="preserve"> }}</w:t>
       </w:r>
     </w:p>
     <w:p>
       <w:pPr>
         <w:rPr>
-          <w:rFonts w:ascii="Times New Roman" w:hAnsi="Times New Roman" w:cs="Times New Roman"/>
-          <w:sz w:val="24"/>
-          <w:szCs w:val="24"/>
-        </w:rPr>
-      </w:pPr>
-      <w:r>
-        <w:rPr>
-          <w:rFonts w:ascii="Times New Roman" w:hAnsi="Times New Roman" w:cs="Times New Roman"/>
-          <w:sz w:val="24"/>
-          <w:szCs w:val="24"/>
-        </w:rPr>
-        <w:t>My proposed new parenting time arrangements are: {{ requested_order }}</w:t>
-      </w:r>
-    </w:p>
-    <w:p>
-      <w:pPr>
-        <w:rPr>
-          <w:rFonts w:ascii="Times New Roman" w:hAnsi="Times New Roman" w:cs="Times New Roman"/>
-          <w:sz w:val="24"/>
-          <w:szCs w:val="24"/>
-        </w:rPr>
-      </w:pPr>
-      <w:r>
-        <w:rPr>
-          <w:rFonts w:ascii="Times New Roman" w:hAnsi="Times New Roman" w:cs="Times New Roman"/>
+          <w:sz w:val="24"/>
+          <w:szCs w:val="24"/>
+        </w:rPr>
+      </w:pPr>
+      <w:r>
+        <w:rPr>
           <w:sz w:val="24"/>
           <w:szCs w:val="24"/>
         </w:rPr>
@@ -2940,6 +2994,23 @@
 </file>
 
 <file path=customXml/item1.xml><?xml version="1.0" encoding="utf-8"?>
+<p:properties xmlns:p="http://schemas.microsoft.com/office/2006/metadata/properties" xmlns:xsi="http://www.w3.org/2001/XMLSchema-instance" xmlns:pc="http://schemas.microsoft.com/office/infopath/2007/PartnerControls">
+  <documentManagement>
+    <_activity xmlns="297510cd-30e8-4429-bab4-c6259e36c9b2" xsi:nil="true"/>
+  </documentManagement>
+</p:properties>
+</file>
+
+<file path=customXml/item2.xml><?xml version="1.0" encoding="utf-8"?>
+<?mso-contentType ?>
+<FormTemplates xmlns="http://schemas.microsoft.com/sharepoint/v3/contenttype/forms">
+  <Display>DocumentLibraryForm</Display>
+  <Edit>DocumentLibraryForm</Edit>
+  <New>DocumentLibraryForm</New>
+</FormTemplates>
+</file>
+
+<file path=customXml/item3.xml><?xml version="1.0" encoding="utf-8"?>
 <ct:contentTypeSchema xmlns:ct="http://schemas.microsoft.com/office/2006/metadata/contentType" xmlns:ma="http://schemas.microsoft.com/office/2006/metadata/properties/metaAttributes" ct:_="" ma:_="" ma:contentTypeName="Document" ma:contentTypeID="0x010100E25108E064038E46834997EC5C04695A" ma:contentTypeVersion="14" ma:contentTypeDescription="Create a new document." ma:contentTypeScope="" ma:versionID="34f8d2769efbf96109714ebeaeec7ef3">
   <xsd:schema xmlns:xsd="http://www.w3.org/2001/XMLSchema" xmlns:xs="http://www.w3.org/2001/XMLSchema" xmlns:p="http://schemas.microsoft.com/office/2006/metadata/properties" xmlns:ns3="297510cd-30e8-4429-bab4-c6259e36c9b2" xmlns:ns4="999011ba-f567-48e4-a02b-5e3b96c6d431" targetNamespace="http://schemas.microsoft.com/office/2006/metadata/properties" ma:root="true" ma:fieldsID="b024a7d642a5b50ea79ff562f4818ed4" ns3:_="" ns4:_="">
     <xsd:import namespace="297510cd-30e8-4429-bab4-c6259e36c9b2"/>
@@ -3166,24 +3237,25 @@
 </ct:contentTypeSchema>
 </file>
 
-<file path=customXml/item2.xml><?xml version="1.0" encoding="utf-8"?>
-<?mso-contentType ?>
-<FormTemplates xmlns="http://schemas.microsoft.com/sharepoint/v3/contenttype/forms">
-  <Display>DocumentLibraryForm</Display>
-  <Edit>DocumentLibraryForm</Edit>
-  <New>DocumentLibraryForm</New>
-</FormTemplates>
+<file path=customXml/itemProps1.xml><?xml version="1.0" encoding="utf-8"?>
+<ds:datastoreItem xmlns:ds="http://schemas.openxmlformats.org/officeDocument/2006/customXml" ds:itemID="{C49CA7F1-33E2-440C-B1DE-853246E599E3}">
+  <ds:schemaRefs>
+    <ds:schemaRef ds:uri="http://schemas.microsoft.com/office/2006/metadata/properties"/>
+    <ds:schemaRef ds:uri="http://schemas.microsoft.com/office/infopath/2007/PartnerControls"/>
+    <ds:schemaRef ds:uri="297510cd-30e8-4429-bab4-c6259e36c9b2"/>
+  </ds:schemaRefs>
+</ds:datastoreItem>
 </file>
 
-<file path=customXml/item3.xml><?xml version="1.0" encoding="utf-8"?>
-<p:properties xmlns:p="http://schemas.microsoft.com/office/2006/metadata/properties" xmlns:xsi="http://www.w3.org/2001/XMLSchema-instance" xmlns:pc="http://schemas.microsoft.com/office/infopath/2007/PartnerControls">
-  <documentManagement>
-    <_activity xmlns="297510cd-30e8-4429-bab4-c6259e36c9b2" xsi:nil="true"/>
-  </documentManagement>
-</p:properties>
+<file path=customXml/itemProps2.xml><?xml version="1.0" encoding="utf-8"?>
+<ds:datastoreItem xmlns:ds="http://schemas.openxmlformats.org/officeDocument/2006/customXml" ds:itemID="{0946B3B7-9868-40B3-962E-691515FEBE2E}">
+  <ds:schemaRefs>
+    <ds:schemaRef ds:uri="http://schemas.microsoft.com/sharepoint/v3/contenttype/forms"/>
+  </ds:schemaRefs>
+</ds:datastoreItem>
 </file>
 
-<file path=customXml/itemProps1.xml><?xml version="1.0" encoding="utf-8"?>
+<file path=customXml/itemProps3.xml><?xml version="1.0" encoding="utf-8"?>
 <ds:datastoreItem xmlns:ds="http://schemas.openxmlformats.org/officeDocument/2006/customXml" ds:itemID="{B6545945-E672-484D-BE5C-8C3C6D34CED9}">
   <ds:schemaRefs>
     <ds:schemaRef ds:uri="http://schemas.microsoft.com/office/2006/metadata/contentType"/>
@@ -3200,22 +3272,4 @@
     <ds:schemaRef ds:uri="http://schemas.microsoft.com/internal/obd"/>
   </ds:schemaRefs>
 </ds:datastoreItem>
-</file>
-
-<file path=customXml/itemProps2.xml><?xml version="1.0" encoding="utf-8"?>
-<ds:datastoreItem xmlns:ds="http://schemas.openxmlformats.org/officeDocument/2006/customXml" ds:itemID="{0946B3B7-9868-40B3-962E-691515FEBE2E}">
-  <ds:schemaRefs>
-    <ds:schemaRef ds:uri="http://schemas.microsoft.com/sharepoint/v3/contenttype/forms"/>
-  </ds:schemaRefs>
-</ds:datastoreItem>
-</file>
-
-<file path=customXml/itemProps3.xml><?xml version="1.0" encoding="utf-8"?>
-<ds:datastoreItem xmlns:ds="http://schemas.openxmlformats.org/officeDocument/2006/customXml" ds:itemID="{C49CA7F1-33E2-440C-B1DE-853246E599E3}">
-  <ds:schemaRefs>
-    <ds:schemaRef ds:uri="http://schemas.microsoft.com/office/2006/metadata/properties"/>
-    <ds:schemaRef ds:uri="http://schemas.microsoft.com/office/infopath/2007/PartnerControls"/>
-    <ds:schemaRef ds:uri="297510cd-30e8-4429-bab4-c6259e36c9b2"/>
-  </ds:schemaRefs>
-</ds:datastoreItem>
 </file>
</xml_diff>